<commit_message>
Editted Just Birds. Added *.wbk to gitignore and config.
</commit_message>
<xml_diff>
--- a/Just Birds.docx
+++ b/Just Birds.docx
@@ -832,10 +832,10 @@
         <w:keepLines w:val="0"/>
       </w:pPr>
       <w:r>
-        <w:t>He puts the keys in the ignition and turns it over. It tries for a m</w:t>
-      </w:r>
-      <w:r>
-        <w:t>omeentt</w:t>
+        <w:t xml:space="preserve">He puts the keys in the ignition and turns it over. It tries for a </w:t>
+      </w:r>
+      <w:r>
+        <w:t>moment</w:t>
       </w:r>
       <w:r>
         <w:t xml:space="preserve"> before starting. He sighs in relief that he didn’t drain the battery down while playing with the alarm and the birds. He scans the area and mirrors, but he doesn’t see one bird. He listens but no sounds come from the roof either. He shakes his head. He had never seen anything like it and now wonders if he really did see what just happen</w:t>
@@ -897,7 +897,15 @@
         <w:keepLines w:val="0"/>
       </w:pPr>
       <w:r>
-        <w:t>Still maintain the spooky voice, he replies “Yessss.”</w:t>
+        <w:t>Still maintain the spooky voice, he replies “</w:t>
+      </w:r>
+      <w:proofErr w:type="spellStart"/>
+      <w:r>
+        <w:t>Yessss</w:t>
+      </w:r>
+      <w:proofErr w:type="spellEnd"/>
+      <w:r>
+        <w:t>.”</w:t>
       </w:r>
     </w:p>
     <w:p>

</xml_diff>